<commit_message>
Cover page with course header and team members; paper starts on page 2
</commit_message>
<xml_diff>
--- a/paper/Research_Paper_CollabDoc.docx
+++ b/paper/Research_Paper_CollabDoc.docx
@@ -2,138 +2,155 @@
 <file path=word/document.xml><?xml version="1.0" encoding="utf-8"?>
 <w:document xmlns:wpc="http://schemas.microsoft.com/office/word/2010/wordprocessingCanvas" xmlns:mo="http://schemas.microsoft.com/office/mac/office/2008/main" xmlns:mc="http://schemas.openxmlformats.org/markup-compatibility/2006" xmlns:mv="urn:schemas-microsoft-com:mac:vml" xmlns:o="urn:schemas-microsoft-com:office:office" xmlns:r="http://schemas.openxmlformats.org/officeDocument/2006/relationships" xmlns:m="http://schemas.openxmlformats.org/officeDocument/2006/math" xmlns:v="urn:schemas-microsoft-com:vml" xmlns:wp14="http://schemas.microsoft.com/office/word/2010/wordprocessingDrawing" xmlns:wp="http://schemas.openxmlformats.org/drawingml/2006/wordprocessingDrawing" xmlns:w10="urn:schemas-microsoft-com:office:word" xmlns:w="http://schemas.openxmlformats.org/wordprocessingml/2006/main" xmlns:w14="http://schemas.microsoft.com/office/word/2010/wordml" xmlns:wpg="http://schemas.microsoft.com/office/word/2010/wordprocessingGroup" xmlns:wpi="http://schemas.microsoft.com/office/word/2010/wordprocessingInk" xmlns:wne="http://schemas.microsoft.com/office/word/2006/wordml" xmlns:wps="http://schemas.microsoft.com/office/word/2010/wordprocessingShape" mc:Ignorable="w14 wp14">
   <w:body>
-    <w:tbl>
-      <w:tblPr>
-        <w:tblW w:type="auto" w:w="0"/>
-        <w:jc w:val="center"/>
-        <w:tblLook w:firstColumn="1" w:firstRow="1" w:lastColumn="0" w:lastRow="0" w:noHBand="0" w:noVBand="1" w:val="04A0"/>
-        <w:tblBorders>
-          <w:top w:val="single" w:sz="4" w:color="999999"/>
-          <w:left w:val="single" w:sz="4" w:color="999999"/>
-          <w:bottom w:val="single" w:sz="4" w:color="999999"/>
-          <w:right w:val="single" w:sz="4" w:color="999999"/>
-          <w:insideH w:val="single" w:sz="4" w:color="999999"/>
-          <w:insideV w:val="single" w:sz="4" w:color="999999"/>
-        </w:tblBorders>
-      </w:tblPr>
-      <w:tblGrid>
-        <w:gridCol w:w="5220"/>
-        <w:gridCol w:w="5220"/>
-      </w:tblGrid>
-      <w:tr>
-        <w:tc>
-          <w:tcPr>
-            <w:tcW w:type="dxa" w:w="2304"/>
-          </w:tcPr>
-          <w:p>
-            <w:pPr>
-              <w:jc w:val="center"/>
-            </w:pPr>
-            <w:r>
-              <w:drawing>
-                <wp:inline xmlns:a="http://schemas.openxmlformats.org/drawingml/2006/main" xmlns:pic="http://schemas.openxmlformats.org/drawingml/2006/picture">
-                  <wp:extent cx="1234440" cy="439176"/>
-                  <wp:docPr id="1" name="Picture 1"/>
-                  <wp:cNvGraphicFramePr>
-                    <a:graphicFrameLocks noChangeAspect="1"/>
-                  </wp:cNvGraphicFramePr>
-                  <a:graphic>
-                    <a:graphicData uri="http://schemas.openxmlformats.org/drawingml/2006/picture">
-                      <pic:pic>
-                        <pic:nvPicPr>
-                          <pic:cNvPr id="0" name="vitlogo.png"/>
-                          <pic:cNvPicPr/>
-                        </pic:nvPicPr>
-                        <pic:blipFill>
-                          <a:blip r:embed="rId9"/>
-                          <a:stretch>
-                            <a:fillRect/>
-                          </a:stretch>
-                        </pic:blipFill>
-                        <pic:spPr>
-                          <a:xfrm>
-                            <a:off x="0" y="0"/>
-                            <a:ext cx="1234440" cy="439176"/>
-                          </a:xfrm>
-                          <a:prstGeom prst="rect"/>
-                        </pic:spPr>
-                      </pic:pic>
-                    </a:graphicData>
-                  </a:graphic>
-                </wp:inline>
-              </w:drawing>
-            </w:r>
-          </w:p>
-        </w:tc>
-        <w:tc>
-          <w:tcPr>
-            <w:tcW w:type="dxa" w:w="7056"/>
-          </w:tcPr>
-          <w:p>
-            <w:pPr>
-              <w:jc w:val="center"/>
-            </w:pPr>
-            <w:r>
-              <w:rPr>
-                <w:rFonts w:ascii="Times New Roman" w:hAnsi="Times New Roman" w:cs="Times New Roman" w:eastAsia="Times New Roman"/>
-                <w:b/>
-                <w:sz w:val="26"/>
-              </w:rPr>
-              <w:t>Vellore Institute of Technology, Chennai</w:t>
-            </w:r>
-          </w:p>
-          <w:p>
-            <w:pPr>
-              <w:jc w:val="center"/>
-            </w:pPr>
-            <w:r>
-              <w:rPr>
-                <w:rFonts w:ascii="Times New Roman" w:hAnsi="Times New Roman" w:cs="Times New Roman" w:eastAsia="Times New Roman"/>
-                <w:b/>
-                <w:sz w:val="24"/>
-              </w:rPr>
-              <w:t>School of Computer Science and Engineering</w:t>
-            </w:r>
-          </w:p>
-          <w:p>
-            <w:pPr>
-              <w:jc w:val="center"/>
-            </w:pPr>
-            <w:r>
-              <w:rPr>
-                <w:rFonts w:ascii="Times New Roman" w:hAnsi="Times New Roman" w:cs="Times New Roman" w:eastAsia="Times New Roman"/>
-                <w:sz w:val="22"/>
-              </w:rPr>
-              <w:t>Course Code: BCSE355L    Course Name: Cloud Architecture Design</w:t>
-            </w:r>
-          </w:p>
-          <w:p>
-            <w:pPr>
-              <w:jc w:val="center"/>
-            </w:pPr>
-            <w:r>
-              <w:rPr>
-                <w:rFonts w:ascii="Times New Roman" w:hAnsi="Times New Roman" w:cs="Times New Roman" w:eastAsia="Times New Roman"/>
-                <w:sz w:val="22"/>
-              </w:rPr>
-              <w:t>Direct Assessment III    Max Marks: 10</w:t>
-            </w:r>
-          </w:p>
-        </w:tc>
-      </w:tr>
-    </w:tbl>
     <w:p>
       <w:pPr>
         <w:keepNext w:val="0"/>
-        <w:spacing w:before="200" w:after="60"/>
-        <w:jc w:val="left"/>
+        <w:spacing w:before="1400" w:after="280"/>
+        <w:jc w:val="center"/>
+      </w:pPr>
+      <w:r>
+        <w:drawing>
+          <wp:inline xmlns:a="http://schemas.openxmlformats.org/drawingml/2006/main" xmlns:pic="http://schemas.openxmlformats.org/drawingml/2006/picture">
+            <wp:extent cx="2560320" cy="910883"/>
+            <wp:docPr id="1" name="Picture 1"/>
+            <wp:cNvGraphicFramePr>
+              <a:graphicFrameLocks noChangeAspect="1"/>
+            </wp:cNvGraphicFramePr>
+            <a:graphic>
+              <a:graphicData uri="http://schemas.openxmlformats.org/drawingml/2006/picture">
+                <pic:pic>
+                  <pic:nvPicPr>
+                    <pic:cNvPr id="0" name="vitlogo.png"/>
+                    <pic:cNvPicPr/>
+                  </pic:nvPicPr>
+                  <pic:blipFill>
+                    <a:blip r:embed="rId9"/>
+                    <a:stretch>
+                      <a:fillRect/>
+                    </a:stretch>
+                  </pic:blipFill>
+                  <pic:spPr>
+                    <a:xfrm>
+                      <a:off x="0" y="0"/>
+                      <a:ext cx="2560320" cy="910883"/>
+                    </a:xfrm>
+                    <a:prstGeom prst="rect"/>
+                  </pic:spPr>
+                </pic:pic>
+              </a:graphicData>
+            </a:graphic>
+          </wp:inline>
+        </w:drawing>
+      </w:r>
+    </w:p>
+    <w:p>
+      <w:pPr>
+        <w:keepNext w:val="0"/>
+        <w:spacing w:before="0" w:after="160"/>
+        <w:jc w:val="center"/>
       </w:pPr>
       <w:r>
         <w:rPr>
           <w:rFonts w:ascii="Times New Roman" w:hAnsi="Times New Roman" w:cs="Times New Roman" w:eastAsia="Times New Roman"/>
           <w:b/>
           <w:i w:val="0"/>
-          <w:sz w:val="22"/>
+          <w:sz w:val="36"/>
+        </w:rPr>
+        <w:t>Vellore Institute of Technology, Chennai</w:t>
+      </w:r>
+    </w:p>
+    <w:p>
+      <w:pPr>
+        <w:keepNext w:val="0"/>
+        <w:spacing w:before="0" w:after="600"/>
+        <w:jc w:val="center"/>
+      </w:pPr>
+      <w:r>
+        <w:rPr>
+          <w:rFonts w:ascii="Times New Roman" w:hAnsi="Times New Roman" w:cs="Times New Roman" w:eastAsia="Times New Roman"/>
+          <w:b/>
+          <w:i w:val="0"/>
+          <w:sz w:val="30"/>
+        </w:rPr>
+        <w:t>School of Computer Science and Engineering</w:t>
+      </w:r>
+    </w:p>
+    <w:p>
+      <w:pPr>
+        <w:keepNext w:val="0"/>
+        <w:spacing w:before="0" w:after="80"/>
+        <w:jc w:val="center"/>
+      </w:pPr>
+      <w:r>
+        <w:rPr>
+          <w:rFonts w:ascii="Times New Roman" w:hAnsi="Times New Roman" w:cs="Times New Roman" w:eastAsia="Times New Roman"/>
+          <w:b w:val="0"/>
+          <w:i w:val="0"/>
+          <w:sz w:val="26"/>
+        </w:rPr>
+        <w:t>Course Code: BCSE355L</w:t>
+      </w:r>
+    </w:p>
+    <w:p>
+      <w:pPr>
+        <w:keepNext w:val="0"/>
+        <w:spacing w:before="0" w:after="480"/>
+        <w:jc w:val="center"/>
+      </w:pPr>
+      <w:r>
+        <w:rPr>
+          <w:rFonts w:ascii="Times New Roman" w:hAnsi="Times New Roman" w:cs="Times New Roman" w:eastAsia="Times New Roman"/>
+          <w:b w:val="0"/>
+          <w:i w:val="0"/>
+          <w:sz w:val="26"/>
+        </w:rPr>
+        <w:t>Course Name: Cloud Architecture Design</w:t>
+      </w:r>
+    </w:p>
+    <w:p>
+      <w:pPr>
+        <w:keepNext w:val="0"/>
+        <w:spacing w:before="0" w:after="80"/>
+        <w:jc w:val="center"/>
+      </w:pPr>
+      <w:r>
+        <w:rPr>
+          <w:rFonts w:ascii="Times New Roman" w:hAnsi="Times New Roman" w:cs="Times New Roman" w:eastAsia="Times New Roman"/>
+          <w:b/>
+          <w:i w:val="0"/>
+          <w:sz w:val="26"/>
+        </w:rPr>
+        <w:t>Direct Assessment III</w:t>
+      </w:r>
+    </w:p>
+    <w:p>
+      <w:pPr>
+        <w:keepNext w:val="0"/>
+        <w:spacing w:before="0" w:after="680"/>
+        <w:jc w:val="center"/>
+      </w:pPr>
+      <w:r>
+        <w:rPr>
+          <w:rFonts w:ascii="Times New Roman" w:hAnsi="Times New Roman" w:cs="Times New Roman" w:eastAsia="Times New Roman"/>
+          <w:b w:val="0"/>
+          <w:i w:val="0"/>
+          <w:sz w:val="26"/>
+        </w:rPr>
+        <w:t>Max Marks: 10</w:t>
+      </w:r>
+    </w:p>
+    <w:p>
+      <w:pPr>
+        <w:keepNext w:val="0"/>
+        <w:spacing w:before="0" w:after="120"/>
+        <w:jc w:val="center"/>
+      </w:pPr>
+      <w:r>
+        <w:rPr>
+          <w:rFonts w:ascii="Times New Roman" w:hAnsi="Times New Roman" w:cs="Times New Roman" w:eastAsia="Times New Roman"/>
+          <w:b/>
+          <w:i w:val="0"/>
+          <w:sz w:val="26"/>
         </w:rPr>
         <w:t>Team Members</w:t>
       </w:r>
@@ -141,6 +158,7 @@
     <w:tbl>
       <w:tblPr>
         <w:tblW w:type="auto" w:w="0"/>
+        <w:jc w:val="center"/>
         <w:tblLook w:firstColumn="1" w:firstRow="1" w:lastColumn="0" w:lastRow="0" w:noHBand="0" w:noVBand="1" w:val="04A0"/>
         <w:tblBorders>
           <w:top w:val="single" w:sz="4" w:color="000000"/>
@@ -158,17 +176,18 @@
       <w:tr>
         <w:tc>
           <w:tcPr>
-            <w:tcW w:type="dxa" w:w="5220"/>
+            <w:tcW w:type="dxa" w:w="2880"/>
           </w:tcPr>
           <w:p>
             <w:pPr>
-              <w:spacing w:after="0"/>
+              <w:spacing w:before="60" w:after="60"/>
+              <w:jc w:val="center"/>
             </w:pPr>
             <w:r>
               <w:rPr>
                 <w:rFonts w:ascii="Times New Roman" w:hAnsi="Times New Roman" w:cs="Times New Roman" w:eastAsia="Times New Roman"/>
                 <w:b/>
-                <w:sz w:val="22"/>
+                <w:sz w:val="24"/>
               </w:rPr>
               <w:t>Reg. ID</w:t>
             </w:r>
@@ -176,17 +195,18 @@
         </w:tc>
         <w:tc>
           <w:tcPr>
-            <w:tcW w:type="dxa" w:w="5220"/>
+            <w:tcW w:type="dxa" w:w="2880"/>
           </w:tcPr>
           <w:p>
             <w:pPr>
-              <w:spacing w:after="0"/>
+              <w:spacing w:before="60" w:after="60"/>
+              <w:jc w:val="center"/>
             </w:pPr>
             <w:r>
               <w:rPr>
                 <w:rFonts w:ascii="Times New Roman" w:hAnsi="Times New Roman" w:cs="Times New Roman" w:eastAsia="Times New Roman"/>
                 <w:b/>
-                <w:sz w:val="22"/>
+                <w:sz w:val="24"/>
               </w:rPr>
               <w:t>Name</w:t>
             </w:r>
@@ -196,17 +216,18 @@
       <w:tr>
         <w:tc>
           <w:tcPr>
-            <w:tcW w:type="dxa" w:w="5220"/>
+            <w:tcW w:type="dxa" w:w="2880"/>
           </w:tcPr>
           <w:p>
             <w:pPr>
-              <w:spacing w:after="0"/>
+              <w:spacing w:before="60" w:after="60"/>
+              <w:jc w:val="center"/>
             </w:pPr>
             <w:r>
               <w:rPr>
                 <w:rFonts w:ascii="Times New Roman" w:hAnsi="Times New Roman" w:cs="Times New Roman" w:eastAsia="Times New Roman"/>
                 <w:b w:val="0"/>
-                <w:sz w:val="22"/>
+                <w:sz w:val="24"/>
               </w:rPr>
               <w:t>24BCE1520</w:t>
             </w:r>
@@ -214,17 +235,18 @@
         </w:tc>
         <w:tc>
           <w:tcPr>
-            <w:tcW w:type="dxa" w:w="5220"/>
+            <w:tcW w:type="dxa" w:w="2880"/>
           </w:tcPr>
           <w:p>
             <w:pPr>
-              <w:spacing w:after="0"/>
+              <w:spacing w:before="60" w:after="60"/>
+              <w:jc w:val="center"/>
             </w:pPr>
             <w:r>
               <w:rPr>
                 <w:rFonts w:ascii="Times New Roman" w:hAnsi="Times New Roman" w:cs="Times New Roman" w:eastAsia="Times New Roman"/>
                 <w:b w:val="0"/>
-                <w:sz w:val="22"/>
+                <w:sz w:val="24"/>
               </w:rPr>
               <w:t>Nitish Kumar</w:t>
             </w:r>
@@ -234,17 +256,18 @@
       <w:tr>
         <w:tc>
           <w:tcPr>
-            <w:tcW w:type="dxa" w:w="5220"/>
+            <w:tcW w:type="dxa" w:w="2880"/>
           </w:tcPr>
           <w:p>
             <w:pPr>
-              <w:spacing w:after="0"/>
+              <w:spacing w:before="60" w:after="60"/>
+              <w:jc w:val="center"/>
             </w:pPr>
             <w:r>
               <w:rPr>
                 <w:rFonts w:ascii="Times New Roman" w:hAnsi="Times New Roman" w:cs="Times New Roman" w:eastAsia="Times New Roman"/>
                 <w:b w:val="0"/>
-                <w:sz w:val="22"/>
+                <w:sz w:val="24"/>
               </w:rPr>
               <w:t>24BCE1594</w:t>
             </w:r>
@@ -252,17 +275,18 @@
         </w:tc>
         <w:tc>
           <w:tcPr>
-            <w:tcW w:type="dxa" w:w="5220"/>
+            <w:tcW w:type="dxa" w:w="2880"/>
           </w:tcPr>
           <w:p>
             <w:pPr>
-              <w:spacing w:after="0"/>
+              <w:spacing w:before="60" w:after="60"/>
+              <w:jc w:val="center"/>
             </w:pPr>
             <w:r>
               <w:rPr>
                 <w:rFonts w:ascii="Times New Roman" w:hAnsi="Times New Roman" w:cs="Times New Roman" w:eastAsia="Times New Roman"/>
                 <w:b w:val="0"/>
-                <w:sz w:val="22"/>
+                <w:sz w:val="24"/>
               </w:rPr>
               <w:t>Balan N</w:t>
             </w:r>
@@ -271,19 +295,8 @@
       </w:tr>
     </w:tbl>
     <w:p>
-      <w:pPr>
-        <w:keepNext w:val="0"/>
-        <w:spacing w:before="120" w:after="120"/>
-        <w:jc w:val="left"/>
-      </w:pPr>
       <w:r>
-        <w:rPr>
-          <w:rFonts w:ascii="Times New Roman" w:hAnsi="Times New Roman" w:cs="Times New Roman" w:eastAsia="Times New Roman"/>
-          <w:b w:val="0"/>
-          <w:i w:val="0"/>
-          <w:sz w:val="20"/>
-        </w:rPr>
-        <w:t>Faculty: S Vigneshwari</w:t>
+        <w:br w:type="page"/>
       </w:r>
     </w:p>
     <w:p>

</xml_diff>

<commit_message>
Cover page: add faculty name
</commit_message>
<xml_diff>
--- a/paper/Research_Paper_CollabDoc.docx
+++ b/paper/Research_Paper_CollabDoc.docx
@@ -294,6 +294,28 @@
         </w:tc>
       </w:tr>
     </w:tbl>
+    <w:p>
+      <w:pPr>
+        <w:keepNext w:val="0"/>
+        <w:spacing w:before="480" w:after="0"/>
+        <w:jc w:val="center"/>
+      </w:pPr>
+      <w:r>
+        <w:rPr>
+          <w:rFonts w:ascii="Times New Roman" w:hAnsi="Times New Roman" w:cs="Times New Roman" w:eastAsia="Times New Roman"/>
+          <w:b/>
+          <w:sz w:val="26"/>
+        </w:rPr>
+        <w:t xml:space="preserve">Faculty: </w:t>
+      </w:r>
+      <w:r>
+        <w:rPr>
+          <w:rFonts w:ascii="Times New Roman" w:hAnsi="Times New Roman" w:cs="Times New Roman" w:eastAsia="Times New Roman"/>
+          <w:sz w:val="26"/>
+        </w:rPr>
+        <w:t>S Vigneshwari</w:t>
+      </w:r>
+    </w:p>
     <w:p>
       <w:r>
         <w:br w:type="page"/>

</xml_diff>